<commit_message>
Domínio próprio conversorgeo.com.br na documentação
README, manual do aluno (regenerado), CLAUDE.md e plano passam a indicar
https://conversorgeo.com.br. Registra DNS no Registro.br, redirecionamento
do www, UptimeRobot a cada 5 min e os Build Filters do Render.

Co-Authored-By: Claude Opus 5.5 <noreply@anthropic.com>
</commit_message>
<xml_diff>
--- a/docs/Manual_Conversor_Geo.docx
+++ b/docs/Manual_Conversor_Geo.docx
@@ -72,7 +72,7 @@
         <w:jc w:val="center"/>
       </w:pPr>
       <w:r>
-        <w:t>Endereço do aplicativo: https://conversorgeo.onrender.com</w:t>
+        <w:t>Endereço do aplicativo: https://conversorgeo.com.br</w:t>
       </w:r>
     </w:p>
     <w:p>
@@ -1198,7 +1198,7 @@
         <w:rPr>
           <w:b/>
         </w:rPr>
-        <w:t>https://conversorgeo.onrender.com</w:t>
+        <w:t>https://conversorgeo.com.br</w:t>
       </w:r>
       <w:r>
         <w:t xml:space="preserve"> no navegador (Chrome, Edge ou Firefox atualizados).</w:t>

</xml_diff>

<commit_message>
Manual do aluno v1.1: TXT/CSV e Editar importação
Seção 4.3 (pontos em TXT/CSV), notação gg,mmss na fundamentação, exemplo
resolvido 5.3 (CSV em UTM 22S para DXF), Editar importação, erros comuns,
exercícios 8 e 9 com gabarito. Nova FIGURA 3 (quadro Colunas do arquivo).

Co-Authored-By: Claude Opus 5.5 <noreply@anthropic.com>
</commit_message>
<xml_diff>
--- a/docs/Manual_Conversor_Geo.docx
+++ b/docs/Manual_Conversor_Geo.docx
@@ -40,7 +40,7 @@
         <w:rPr>
           <w:i/>
         </w:rPr>
-        <w:t>Conversão entre DXF, KML/KMZ, Shapefile e planilha SIGEF, com visualização sobre imagem e croqui de localização</w:t>
+        <w:t>Conversão entre DXF, KML/KMZ, Shapefile, planilha SIGEF e pontos em TXT/CSV, com visualização sobre imagem e croqui de localização</w:t>
       </w:r>
     </w:p>
     <w:p/>
@@ -80,7 +80,7 @@
         <w:jc w:val="center"/>
       </w:pPr>
       <w:r>
-        <w:t>Versão 1.0 — setembro de 2026</w:t>
+        <w:t>Versão 1.1 — outubro de 2026</w:t>
       </w:r>
     </w:p>
     <w:p>
@@ -166,6 +166,20 @@
         <w:rPr>
           <w:b/>
         </w:rPr>
+        <w:t>importar</w:t>
+      </w:r>
+      <w:r>
+        <w:t xml:space="preserve"> pontos de arquivos TXT/CSV, indicando as colunas e o formato das coordenadas (UTM, graus decimais ou gg,mmss);</w:t>
+      </w:r>
+    </w:p>
+    <w:p>
+      <w:pPr>
+        <w:pStyle w:val="ListBullet"/>
+      </w:pPr>
+      <w:r>
+        <w:rPr>
+          <w:b/>
+        </w:rPr>
         <w:t>conferir</w:t>
       </w:r>
       <w:r>
@@ -216,7 +230,7 @@
         <w:jc w:val="both"/>
       </w:pPr>
       <w:r>
-        <w:t>No escritório de agrimensura, o mesmo levantamento circula por programas diferentes: o desenho técnico é feito em CAD (DXF), o cliente confere a área no Google Earth (KML/KMZ), o órgão ambiental ou a prefeitura pede Shapefile, e a certificação no INCRA parte da planilha de dados do SIGEF. Cada conversão feita à mão é uma oportunidade de erro de fuso, de hemisfério ou de sistema de referência — erros que deslocam o imóvel de centenas de metros a centenas de quilômetros.</w:t>
+        <w:t>No escritório de agrimensura, o mesmo levantamento circula por programas diferentes: o desenho técnico é feito em CAD (DXF), o cliente confere a área no Google Earth (KML/KMZ), o órgão ambiental ou a prefeitura pede Shapefile, a certificação no INCRA parte da planilha de dados do SIGEF e os pontos de campo chegam da estação total ou do receptor GNSS em arquivos de texto (TXT/CSV). Cada conversão feita à mão é uma oportunidade de erro de fuso, de hemisfério ou de sistema de referência — erros que deslocam o imóvel de centenas de metros a centenas de quilômetros.</w:t>
       </w:r>
     </w:p>
     <w:p>
@@ -655,6 +669,60 @@
       </w:r>
       <w:r>
         <w:t xml:space="preserve"> do Shapefile gerado e são úteis para configurar o SRC (sistema de referência de coordenadas) no QGIS.</w:t>
+      </w:r>
+    </w:p>
+    <w:p>
+      <w:pPr>
+        <w:jc w:val="both"/>
+      </w:pPr>
+      <w:r>
+        <w:t xml:space="preserve">Em arquivos de pontos é comum a notação compacta </w:t>
+      </w:r>
+      <w:r>
+        <w:rPr>
+          <w:b/>
+        </w:rPr>
+        <w:t>gg,mmss</w:t>
+      </w:r>
+      <w:r>
+        <w:t xml:space="preserve">, usada por calculadoras e programas de topografia: a parte inteira são os graus e, depois da vírgula, os dois primeiros dígitos são os minutos, os dois seguintes os segundos e o restante a fração do segundo. Sul e oeste levam </w:t>
+      </w:r>
+      <w:r>
+        <w:rPr>
+          <w:b/>
+        </w:rPr>
+        <w:t>sinal negativo</w:t>
+      </w:r>
+      <w:r>
+        <w:t>. A conversão para graus decimais é:</w:t>
+      </w:r>
+    </w:p>
+    <w:p>
+      <w:pPr>
+        <w:jc w:val="center"/>
+      </w:pPr>
+      <w:r>
+        <w:rPr>
+          <w:b/>
+        </w:rPr>
+        <w:t>graus decimais = ± (gg + mm / 60 + ss,sss / 3600)</w:t>
+      </w:r>
+    </w:p>
+    <w:p>
+      <w:pPr>
+        <w:jc w:val="both"/>
+      </w:pPr>
+      <w:r>
+        <w:t xml:space="preserve">Exemplo: −27,3543092 = 27°35'43,092" S → −(27 + 35/60 + 43,092/3600) = </w:t>
+      </w:r>
+      <w:r>
+        <w:rPr>
+          <w:b/>
+        </w:rPr>
+        <w:t>−27,5953033°</w:t>
+      </w:r>
+      <w:r>
+        <w:t>. Minutos e segundos sempre menores que 60; quando faltam dígitos, completa-se com zeros à direita (48,5 = 48°50'00").</w:t>
       </w:r>
     </w:p>
     <w:p>
@@ -1085,6 +1153,80 @@
               <w:rPr>
                 <w:sz w:val="19"/>
               </w:rPr>
+              <w:t>TXT / CSV (pontos)</w:t>
+            </w:r>
+          </w:p>
+        </w:tc>
+        <w:tc>
+          <w:tcPr>
+            <w:tcW w:type="dxa" w:w="964"/>
+          </w:tcPr>
+          <w:p>
+            <w:r>
+              <w:rPr>
+                <w:sz w:val="19"/>
+              </w:rPr>
+            </w:r>
+            <w:r>
+              <w:rPr>
+                <w:sz w:val="19"/>
+              </w:rPr>
+              <w:t>Sim</w:t>
+            </w:r>
+          </w:p>
+        </w:tc>
+        <w:tc>
+          <w:tcPr>
+            <w:tcW w:type="dxa" w:w="907"/>
+          </w:tcPr>
+          <w:p>
+            <w:r>
+              <w:rPr>
+                <w:sz w:val="19"/>
+              </w:rPr>
+            </w:r>
+            <w:r>
+              <w:rPr>
+                <w:sz w:val="19"/>
+              </w:rPr>
+              <w:t>Não</w:t>
+            </w:r>
+          </w:p>
+        </w:tc>
+        <w:tc>
+          <w:tcPr>
+            <w:tcW w:type="dxa" w:w="5386"/>
+          </w:tcPr>
+          <w:p>
+            <w:r>
+              <w:rPr>
+                <w:sz w:val="19"/>
+              </w:rPr>
+            </w:r>
+            <w:r>
+              <w:rPr>
+                <w:sz w:val="19"/>
+              </w:rPr>
+              <w:t>Colunas indicadas pelo usuário; UTM, graus decimais ou gg,mmss. Código vira layer; pontos podem ser ligados em linha ou polígono.</w:t>
+            </w:r>
+          </w:p>
+        </w:tc>
+      </w:tr>
+      <w:tr>
+        <w:tc>
+          <w:tcPr>
+            <w:tcW w:type="dxa" w:w="1814"/>
+          </w:tcPr>
+          <w:p>
+            <w:r>
+              <w:rPr>
+                <w:sz w:val="19"/>
+              </w:rPr>
+            </w:r>
+            <w:r>
+              <w:rPr>
+                <w:sz w:val="19"/>
+              </w:rPr>
               <w:t>DWG</w:t>
             </w:r>
           </w:p>
@@ -1329,7 +1471,7 @@
         <w:t>Formato</w:t>
       </w:r>
       <w:r>
-        <w:t>, escolher o tipo do arquivo: DXF, KML / KMZ, Shapefile (.zip) ou Planilha SIGEF (.ods).</w:t>
+        <w:t>, escolher o tipo do arquivo: DXF, KML / KMZ, Shapefile (.zip), Planilha SIGEF (.ods) ou Texto TXT / CSV (colunas) — este último na seção 4.3.</w:t>
       </w:r>
     </w:p>
     <w:p>
@@ -1496,68 +1638,365 @@
         <w:rPr>
           <w:color w:val="2E7D32"/>
         </w:rPr>
-        <w:t>4.3 Conferir no mapa</w:t>
+        <w:t>4.3 Pontos em TXT ou CSV</w:t>
       </w:r>
     </w:p>
     <w:p>
       <w:pPr>
-        <w:pStyle w:val="ListBullet"/>
-      </w:pPr>
-      <w:r>
-        <w:t xml:space="preserve">O mapa se ajusta ao arquivo. Conferir se o desenho caiu </w:t>
-      </w:r>
+        <w:jc w:val="both"/>
+      </w:pPr>
+      <w:r>
+        <w:t xml:space="preserve">Arquivos de texto exportados da estação total, do receptor GNSS ou de uma planilha (extensões </w:t>
+      </w:r>
+      <w:r>
+        <w:rPr>
+          <w:rFonts w:ascii="Consolas" w:hAnsi="Consolas"/>
+          <w:sz w:val="20"/>
+        </w:rPr>
+        <w:t>.txt</w:t>
+      </w:r>
+      <w:r>
+        <w:t xml:space="preserve"> e </w:t>
+      </w:r>
+      <w:r>
+        <w:rPr>
+          <w:rFonts w:ascii="Consolas" w:hAnsi="Consolas"/>
+          <w:sz w:val="20"/>
+        </w:rPr>
+        <w:t>.csv</w:t>
+      </w:r>
+      <w:r>
+        <w:t>) não têm um padrão único de colunas. Por isso, o aplicativo mostra o arquivo e pede que o usuário indique o que é cada coluna.</w:t>
+      </w:r>
+    </w:p>
+    <w:p>
+      <w:pPr>
+        <w:spacing w:after="60"/>
+        <w:ind w:left="510" w:hanging="340"/>
+      </w:pPr>
       <w:r>
         <w:rPr>
           <w:b/>
         </w:rPr>
-        <w:t>no lugar certo</w:t>
-      </w:r>
-      <w:r>
-        <w:t xml:space="preserve"> da imagem — esse é o principal controle de qualidade da conversão.</w:t>
-      </w:r>
-    </w:p>
-    <w:p>
-      <w:pPr>
-        <w:pStyle w:val="ListBullet"/>
-      </w:pPr>
-      <w:r>
-        <w:t xml:space="preserve">No quadro </w:t>
+        <w:t xml:space="preserve">1. </w:t>
+      </w:r>
+      <w:r>
+        <w:t xml:space="preserve">Em </w:t>
       </w:r>
       <w:r>
         <w:rPr>
           <w:b/>
         </w:rPr>
-        <w:t>Layers</w:t>
-      </w:r>
-      <w:r>
-        <w:t xml:space="preserve">, cada layer tem uma caixa para ligar/desligar e um quadrado com a cor. Clicar no quadrado permite </w:t>
+        <w:t>Formato</w:t>
+      </w:r>
+      <w:r>
+        <w:t xml:space="preserve">, escolher </w:t>
       </w:r>
       <w:r>
         <w:rPr>
           <w:b/>
         </w:rPr>
-        <w:t>trocar a cor</w:t>
-      </w:r>
-      <w:r>
-        <w:t>; a nova cor vale para o mapa, para a imagem exportada e para os arquivos de saída.</w:t>
+        <w:t>Texto TXT / CSV (colunas)</w:t>
+      </w:r>
+      <w:r>
+        <w:t xml:space="preserve">. Em </w:t>
+      </w:r>
+      <w:r>
+        <w:rPr>
+          <w:b/>
+        </w:rPr>
+        <w:t>Sistema de coordenadas</w:t>
+      </w:r>
+      <w:r>
+        <w:t xml:space="preserve">, escolher </w:t>
+      </w:r>
+      <w:r>
+        <w:rPr>
+          <w:b/>
+        </w:rPr>
+        <w:t>UTM</w:t>
+      </w:r>
+      <w:r>
+        <w:t xml:space="preserve"> (com fuso e hemisfério), </w:t>
+      </w:r>
+      <w:r>
+        <w:rPr>
+          <w:b/>
+        </w:rPr>
+        <w:t>Geodésicas (graus decimais)</w:t>
+      </w:r>
+      <w:r>
+        <w:t xml:space="preserve"> ou </w:t>
+      </w:r>
+      <w:r>
+        <w:rPr>
+          <w:b/>
+        </w:rPr>
+        <w:t>Geodésicas (gg,mmss)</w:t>
+      </w:r>
+      <w:r>
+        <w:t xml:space="preserve"> — esta terceira opção só existe para TXT/CSV. Nas geodésicas, sul e oeste com sinal negativo.</w:t>
       </w:r>
     </w:p>
     <w:p>
       <w:pPr>
-        <w:pStyle w:val="ListBullet"/>
-      </w:pPr>
-      <w:r>
-        <w:t>Clicar numa feição abre os atributos (por exemplo, sigmas, método de posicionamento, tipo de limite e confrontante dos vértices do SIGEF).</w:t>
+        <w:spacing w:after="60"/>
+        <w:ind w:left="510" w:hanging="340"/>
+      </w:pPr>
+      <w:r>
+        <w:rPr>
+          <w:b/>
+        </w:rPr>
+        <w:t xml:space="preserve">2. </w:t>
+      </w:r>
+      <w:r>
+        <w:t xml:space="preserve">Enviar o arquivo. Aparece o quadro </w:t>
+      </w:r>
+      <w:r>
+        <w:rPr>
+          <w:b/>
+        </w:rPr>
+        <w:t>Colunas do arquivo</w:t>
+      </w:r>
+      <w:r>
+        <w:t>, com as primeiras linhas.</w:t>
       </w:r>
     </w:p>
     <w:p>
       <w:pPr>
-        <w:pStyle w:val="ListBullet"/>
-      </w:pPr>
-      <w:r>
-        <w:t>Avisos aparecem em laranja abaixo dos quadros; erros, em vermelho (ver seção 6).</w:t>
+        <w:spacing w:after="60"/>
+        <w:ind w:left="510" w:hanging="340"/>
+      </w:pPr>
+      <w:r>
+        <w:rPr>
+          <w:b/>
+        </w:rPr>
+        <w:t xml:space="preserve">3. </w:t>
+      </w:r>
+      <w:r>
+        <w:t xml:space="preserve">Conferir o </w:t>
+      </w:r>
+      <w:r>
+        <w:rPr>
+          <w:b/>
+        </w:rPr>
+        <w:t>Separador</w:t>
+      </w:r>
+      <w:r>
+        <w:t xml:space="preserve"> (ponto e vírgula, tabulação, vírgula ou espaço) e a caixa </w:t>
+      </w:r>
+      <w:r>
+        <w:rPr>
+          <w:b/>
+        </w:rPr>
+        <w:t>Primeira linha é cabeçalho</w:t>
+      </w:r>
+      <w:r>
+        <w:t>. Os dois são detectados automaticamente; se a prévia aparecer com as colunas misturadas, trocar o separador.</w:t>
       </w:r>
     </w:p>
+    <w:p>
+      <w:pPr>
+        <w:spacing w:after="60"/>
+        <w:ind w:left="510" w:hanging="340"/>
+      </w:pPr>
+      <w:r>
+        <w:rPr>
+          <w:b/>
+        </w:rPr>
+        <w:t xml:space="preserve">4. </w:t>
+      </w:r>
+      <w:r>
+        <w:t xml:space="preserve">Indicar as colunas: </w:t>
+      </w:r>
+      <w:r>
+        <w:rPr>
+          <w:b/>
+        </w:rPr>
+        <w:t>E / Longitude</w:t>
+      </w:r>
+      <w:r>
+        <w:t xml:space="preserve"> e </w:t>
+      </w:r>
+      <w:r>
+        <w:rPr>
+          <w:b/>
+        </w:rPr>
+        <w:t>N / Latitude</w:t>
+      </w:r>
+      <w:r>
+        <w:t xml:space="preserve"> (obrigatórias), </w:t>
+      </w:r>
+      <w:r>
+        <w:rPr>
+          <w:b/>
+        </w:rPr>
+        <w:t>Nome do ponto</w:t>
+      </w:r>
+      <w:r>
+        <w:t xml:space="preserve">, </w:t>
+      </w:r>
+      <w:r>
+        <w:rPr>
+          <w:b/>
+        </w:rPr>
+        <w:t>h / Z</w:t>
+      </w:r>
+      <w:r>
+        <w:t xml:space="preserve"> e </w:t>
+      </w:r>
+      <w:r>
+        <w:rPr>
+          <w:b/>
+        </w:rPr>
+        <w:t>Código → layer</w:t>
+      </w:r>
+      <w:r>
+        <w:t xml:space="preserve"> (opcionais). O aplicativo já sugere as colunas pelos nomes do cabeçalho (Ponto, E, N, Cota, Código…) ou pela ordem dos dados.</w:t>
+      </w:r>
+    </w:p>
+    <w:p>
+      <w:pPr>
+        <w:spacing w:after="60"/>
+        <w:ind w:left="510" w:hanging="340"/>
+      </w:pPr>
+      <w:r>
+        <w:rPr>
+          <w:b/>
+        </w:rPr>
+        <w:t xml:space="preserve">5. </w:t>
+      </w:r>
+      <w:r>
+        <w:t xml:space="preserve">Escolher a geometria: </w:t>
+      </w:r>
+      <w:r>
+        <w:rPr>
+          <w:b/>
+        </w:rPr>
+        <w:t>Só pontos</w:t>
+      </w:r>
+      <w:r>
+        <w:t xml:space="preserve">, </w:t>
+      </w:r>
+      <w:r>
+        <w:rPr>
+          <w:b/>
+        </w:rPr>
+        <w:t>Pontos e linha</w:t>
+      </w:r>
+      <w:r>
+        <w:t xml:space="preserve"> ou </w:t>
+      </w:r>
+      <w:r>
+        <w:rPr>
+          <w:b/>
+        </w:rPr>
+        <w:t>Pontos e polígono</w:t>
+      </w:r>
+      <w:r>
+        <w:t xml:space="preserve"> (fecha no primeiro ponto). Com coluna de código, escolher também como </w:t>
+      </w:r>
+      <w:r>
+        <w:rPr>
+          <w:b/>
+        </w:rPr>
+        <w:t>ligar os pontos</w:t>
+      </w:r>
+      <w:r>
+        <w:t xml:space="preserve">: </w:t>
+      </w:r>
+      <w:r>
+        <w:rPr>
+          <w:b/>
+        </w:rPr>
+        <w:t>na sequência do arquivo (todos os pontos)</w:t>
+      </w:r>
+      <w:r>
+        <w:t xml:space="preserve"> — uma linha ou polígono na layer LIGACAO — ou </w:t>
+      </w:r>
+      <w:r>
+        <w:rPr>
+          <w:b/>
+        </w:rPr>
+        <w:t>na sequência, por código</w:t>
+      </w:r>
+      <w:r>
+        <w:t xml:space="preserve"> — um traçado por layer.</w:t>
+      </w:r>
+    </w:p>
+    <w:p>
+      <w:pPr>
+        <w:spacing w:after="60"/>
+        <w:ind w:left="510" w:hanging="340"/>
+      </w:pPr>
+      <w:r>
+        <w:rPr>
+          <w:b/>
+        </w:rPr>
+        <w:t xml:space="preserve">6. </w:t>
+      </w:r>
+      <w:r>
+        <w:t xml:space="preserve">Clicar em </w:t>
+      </w:r>
+      <w:r>
+        <w:rPr>
+          <w:b/>
+        </w:rPr>
+        <w:t>Mostrar arquivo na imagem</w:t>
+      </w:r>
+      <w:r>
+        <w:t>.</w:t>
+      </w:r>
+    </w:p>
+    <w:tbl>
+      <w:tblPr>
+        <w:tblStyle w:val="TableGrid"/>
+        <w:tblW w:type="auto" w:w="0"/>
+        <w:tblLook w:firstColumn="1" w:firstRow="1" w:lastColumn="0" w:lastRow="0" w:noHBand="0" w:noVBand="1" w:val="04A0"/>
+      </w:tblPr>
+      <w:tblGrid>
+        <w:gridCol w:w="9071"/>
+      </w:tblGrid>
+      <w:tr>
+        <w:tc>
+          <w:tcPr>
+            <w:tcW w:type="dxa" w:w="9071"/>
+            <w:shd w:val="clear" w:color="auto" w:fill="FFF8E1"/>
+          </w:tcPr>
+          <w:p>
+            <w:r/>
+            <w:r>
+              <w:rPr>
+                <w:b/>
+              </w:rPr>
+              <w:t xml:space="preserve">Atenção: </w:t>
+            </w:r>
+            <w:r>
+              <w:t xml:space="preserve">a linha e o polígono seguem </w:t>
+            </w:r>
+            <w:r>
+              <w:rPr>
+                <w:b/>
+              </w:rPr>
+              <w:t>a ordem das linhas do arquivo</w:t>
+            </w:r>
+            <w:r>
+              <w:t xml:space="preserve">. O aplicativo não reordena os pontos: se o caminhamento estiver fora de ordem, o polígono sai cruzado. Quando uma linha do arquivo tem problema, a mensagem informa o </w:t>
+            </w:r>
+            <w:r>
+              <w:rPr>
+                <w:b/>
+              </w:rPr>
+              <w:t>número da linha</w:t>
+            </w:r>
+            <w:r>
+              <w:t>.</w:t>
+            </w:r>
+          </w:p>
+        </w:tc>
+      </w:tr>
+    </w:tbl>
+    <w:p/>
     <w:p>
       <w:pPr>
         <w:jc w:val="center"/>
@@ -1567,7 +2006,7 @@
           <w:b/>
           <w:color w:val="C62828"/>
         </w:rPr>
-        <w:t>[FIGURA 3 — mapa com a parcela do SIGEF sobre a imagem, painel de layers e janela de atributos]</w:t>
+        <w:t>[FIGURA 3 — quadro Colunas do arquivo com separador, prévia, colunas indicadas e geometria]</w:t>
       </w:r>
     </w:p>
     <w:p>
@@ -1578,7 +2017,7 @@
         <w:rPr>
           <w:i/>
         </w:rPr>
-        <w:t>Figura 3 — mapa com a parcela do SIGEF sobre a imagem, painel de layers e janela de atributos</w:t>
+        <w:t>Figura 3 — quadro Colunas do arquivo com separador, prévia, colunas indicadas e geometria</w:t>
       </w:r>
       <w:r>
         <w:rPr>
@@ -1596,7 +2035,107 @@
         <w:rPr>
           <w:color w:val="2E7D32"/>
         </w:rPr>
-        <w:t>4.4 Vários arquivos numa saída única</w:t>
+        <w:t>4.4 Conferir no mapa</w:t>
+      </w:r>
+    </w:p>
+    <w:p>
+      <w:pPr>
+        <w:pStyle w:val="ListBullet"/>
+      </w:pPr>
+      <w:r>
+        <w:t xml:space="preserve">O mapa se ajusta ao arquivo. Conferir se o desenho caiu </w:t>
+      </w:r>
+      <w:r>
+        <w:rPr>
+          <w:b/>
+        </w:rPr>
+        <w:t>no lugar certo</w:t>
+      </w:r>
+      <w:r>
+        <w:t xml:space="preserve"> da imagem — esse é o principal controle de qualidade da conversão.</w:t>
+      </w:r>
+    </w:p>
+    <w:p>
+      <w:pPr>
+        <w:pStyle w:val="ListBullet"/>
+      </w:pPr>
+      <w:r>
+        <w:t xml:space="preserve">No quadro </w:t>
+      </w:r>
+      <w:r>
+        <w:rPr>
+          <w:b/>
+        </w:rPr>
+        <w:t>Layers</w:t>
+      </w:r>
+      <w:r>
+        <w:t xml:space="preserve">, cada layer tem uma caixa para ligar/desligar e um quadrado com a cor. Clicar no quadrado permite </w:t>
+      </w:r>
+      <w:r>
+        <w:rPr>
+          <w:b/>
+        </w:rPr>
+        <w:t>trocar a cor</w:t>
+      </w:r>
+      <w:r>
+        <w:t>; a nova cor vale para o mapa, para a imagem exportada e para os arquivos de saída.</w:t>
+      </w:r>
+    </w:p>
+    <w:p>
+      <w:pPr>
+        <w:pStyle w:val="ListBullet"/>
+      </w:pPr>
+      <w:r>
+        <w:t>Clicar numa feição abre os atributos (por exemplo, sigmas, método de posicionamento, tipo de limite e confrontante dos vértices do SIGEF).</w:t>
+      </w:r>
+    </w:p>
+    <w:p>
+      <w:pPr>
+        <w:pStyle w:val="ListBullet"/>
+      </w:pPr>
+      <w:r>
+        <w:t>Avisos aparecem em laranja abaixo dos quadros; erros, em vermelho (ver seção 6).</w:t>
+      </w:r>
+    </w:p>
+    <w:p>
+      <w:pPr>
+        <w:jc w:val="center"/>
+      </w:pPr>
+      <w:r>
+        <w:rPr>
+          <w:b/>
+          <w:color w:val="C62828"/>
+        </w:rPr>
+        <w:t>[FIGURA 4 — mapa com a parcela do SIGEF sobre a imagem, painel de layers e janela de atributos]</w:t>
+      </w:r>
+    </w:p>
+    <w:p>
+      <w:pPr>
+        <w:jc w:val="center"/>
+      </w:pPr>
+      <w:r>
+        <w:rPr>
+          <w:i/>
+        </w:rPr>
+        <w:t>Figura 4 — mapa com a parcela do SIGEF sobre a imagem, painel de layers e janela de atributos</w:t>
+      </w:r>
+      <w:r>
+        <w:rPr>
+          <w:sz w:val="18"/>
+        </w:rPr>
+        <w:br/>
+        <w:t>Fonte: o autor (Conversor Geo).</w:t>
+      </w:r>
+    </w:p>
+    <w:p>
+      <w:pPr>
+        <w:pStyle w:val="Heading2"/>
+      </w:pPr>
+      <w:r>
+        <w:rPr>
+          <w:color w:val="2E7D32"/>
+        </w:rPr>
+        <w:t>4.5 Vários arquivos numa saída única</w:t>
       </w:r>
     </w:p>
     <w:p>
@@ -1637,6 +2176,41 @@
         <w:rPr>
           <w:b/>
         </w:rPr>
+        <w:t>✎ (Editar importação)</w:t>
+      </w:r>
+      <w:r>
+        <w:t xml:space="preserve"> de cada item devolve o arquivo para a entrada com o formato, o sistema e, no TXT/CSV, as colunas usadas. Corrigir o que for preciso (um fuso errado, outra geometria) e clicar em </w:t>
+      </w:r>
+      <w:r>
+        <w:rPr>
+          <w:b/>
+        </w:rPr>
+        <w:t>Atualizar na imagem</w:t>
+      </w:r>
+      <w:r>
+        <w:t xml:space="preserve">: o arquivo é substituído no mesmo lugar da lista. </w:t>
+      </w:r>
+      <w:r>
+        <w:rPr>
+          <w:b/>
+        </w:rPr>
+        <w:t>Cancelar edição</w:t>
+      </w:r>
+      <w:r>
+        <w:t xml:space="preserve"> mantém o arquivo como estava.</w:t>
+      </w:r>
+    </w:p>
+    <w:p>
+      <w:pPr>
+        <w:pStyle w:val="ListBullet"/>
+      </w:pPr>
+      <w:r>
+        <w:t xml:space="preserve">O </w:t>
+      </w:r>
+      <w:r>
+        <w:rPr>
+          <w:b/>
+        </w:rPr>
         <w:t>✕</w:t>
       </w:r>
       <w:r>
@@ -1665,7 +2239,7 @@
         <w:rPr>
           <w:color w:val="2E7D32"/>
         </w:rPr>
-        <w:t>4.5 Converter e baixar (Saída)</w:t>
+        <w:t>4.6 Converter e baixar (Saída)</w:t>
       </w:r>
     </w:p>
     <w:p>
@@ -2042,7 +2616,7 @@
         <w:rPr>
           <w:color w:val="2E7D32"/>
         </w:rPr>
-        <w:t>4.6 Croqui de localização (imagem)</w:t>
+        <w:t>4.7 Croqui de localização (imagem)</w:t>
       </w:r>
     </w:p>
     <w:p>
@@ -2245,7 +2819,7 @@
           <w:b/>
           <w:color w:val="C62828"/>
         </w:rPr>
-        <w:t>[FIGURA 4 — croqui exportado: ortofoto SC, parcela, nomes de ruas do OpenStreetMap, norte e escala]</w:t>
+        <w:t>[FIGURA 5 — croqui exportado: ortofoto SC, parcela, nomes de ruas do OpenStreetMap, norte e escala]</w:t>
       </w:r>
     </w:p>
     <w:p>
@@ -2256,7 +2830,7 @@
         <w:rPr>
           <w:i/>
         </w:rPr>
-        <w:t>Figura 4 — croqui exportado</w:t>
+        <w:t>Figura 5 — croqui exportado</w:t>
       </w:r>
       <w:r>
         <w:rPr>
@@ -2673,6 +3247,272 @@
       </w:r>
       <w:r>
         <w:t>No QGIS, arrastar o ZIP para o mapa: o SRC é reconhecido pelo .prj como SIRGAS 2000 / UTM zone 22S (EPSG:31982).</w:t>
+      </w:r>
+    </w:p>
+    <w:p>
+      <w:pPr>
+        <w:pStyle w:val="Heading2"/>
+      </w:pPr>
+      <w:r>
+        <w:rPr>
+          <w:color w:val="2E7D32"/>
+        </w:rPr>
+        <w:t>5.3 Pontos de campo em CSV para DXF</w:t>
+      </w:r>
+    </w:p>
+    <w:p>
+      <w:pPr>
+        <w:jc w:val="both"/>
+      </w:pPr>
+      <w:r>
+        <w:t xml:space="preserve">Arquivo: </w:t>
+      </w:r>
+      <w:r>
+        <w:rPr>
+          <w:rFonts w:ascii="Consolas" w:hAnsi="Consolas"/>
+          <w:sz w:val="20"/>
+        </w:rPr>
+        <w:t>exemplo_txt_utm22s.csv</w:t>
+      </w:r>
+      <w:r>
+        <w:t xml:space="preserve"> (fornecido pelo professor), separado por ponto e vírgula, com cabeçalho </w:t>
+      </w:r>
+      <w:r>
+        <w:rPr>
+          <w:rFonts w:ascii="Consolas" w:hAnsi="Consolas"/>
+          <w:sz w:val="20"/>
+        </w:rPr>
+        <w:t>Ponto;E;N;Cota;Codigo</w:t>
+      </w:r>
+      <w:r>
+        <w:t xml:space="preserve"> e seis pontos em UTM 22 Sul: quatro cantos de cerca (M1 a M4, código CERCA) e dois postes (P1 e P2, código POSTE), intercalados na ordem do levantamento.</w:t>
+      </w:r>
+    </w:p>
+    <w:p>
+      <w:pPr>
+        <w:spacing w:after="60"/>
+        <w:ind w:left="510" w:hanging="340"/>
+      </w:pPr>
+      <w:r>
+        <w:rPr>
+          <w:b/>
+        </w:rPr>
+        <w:t xml:space="preserve">1. </w:t>
+      </w:r>
+      <w:r>
+        <w:t xml:space="preserve">Entrada: </w:t>
+      </w:r>
+      <w:r>
+        <w:rPr>
+          <w:b/>
+        </w:rPr>
+        <w:t>Texto TXT / CSV (colunas)</w:t>
+      </w:r>
+      <w:r>
+        <w:t xml:space="preserve">, </w:t>
+      </w:r>
+      <w:r>
+        <w:rPr>
+          <w:b/>
+        </w:rPr>
+        <w:t>UTM</w:t>
+      </w:r>
+      <w:r>
+        <w:t xml:space="preserve">, fuso </w:t>
+      </w:r>
+      <w:r>
+        <w:rPr>
+          <w:b/>
+        </w:rPr>
+        <w:t>22</w:t>
+      </w:r>
+      <w:r>
+        <w:t xml:space="preserve">, </w:t>
+      </w:r>
+      <w:r>
+        <w:rPr>
+          <w:b/>
+        </w:rPr>
+        <w:t>Sul</w:t>
+      </w:r>
+      <w:r>
+        <w:t>. Enviar o arquivo.</w:t>
+      </w:r>
+    </w:p>
+    <w:p>
+      <w:pPr>
+        <w:spacing w:after="60"/>
+        <w:ind w:left="510" w:hanging="340"/>
+      </w:pPr>
+      <w:r>
+        <w:rPr>
+          <w:b/>
+        </w:rPr>
+        <w:t xml:space="preserve">2. </w:t>
+      </w:r>
+      <w:r>
+        <w:t xml:space="preserve">No quadro Colunas do arquivo, conferir o que foi detectado: separador </w:t>
+      </w:r>
+      <w:r>
+        <w:rPr>
+          <w:b/>
+        </w:rPr>
+        <w:t>Ponto e vírgula</w:t>
+      </w:r>
+      <w:r>
+        <w:t xml:space="preserve">, </w:t>
+      </w:r>
+      <w:r>
+        <w:rPr>
+          <w:b/>
+        </w:rPr>
+        <w:t>cabeçalho marcado</w:t>
+      </w:r>
+      <w:r>
+        <w:t>, E = coluna 2, N = coluna 3, Nome = coluna 1, h / Z = coluna 4 e Código = coluna 5.</w:t>
+      </w:r>
+    </w:p>
+    <w:p>
+      <w:pPr>
+        <w:spacing w:after="60"/>
+        <w:ind w:left="510" w:hanging="340"/>
+      </w:pPr>
+      <w:r>
+        <w:rPr>
+          <w:b/>
+        </w:rPr>
+        <w:t xml:space="preserve">3. </w:t>
+      </w:r>
+      <w:r>
+        <w:t xml:space="preserve">Geometria </w:t>
+      </w:r>
+      <w:r>
+        <w:rPr>
+          <w:b/>
+        </w:rPr>
+        <w:t>Pontos e polígono</w:t>
+      </w:r>
+      <w:r>
+        <w:t xml:space="preserve">; ligar os pontos </w:t>
+      </w:r>
+      <w:r>
+        <w:rPr>
+          <w:b/>
+        </w:rPr>
+        <w:t>na sequência, por código</w:t>
+      </w:r>
+      <w:r>
+        <w:t>. Mostrar na imagem.</w:t>
+      </w:r>
+    </w:p>
+    <w:p>
+      <w:pPr>
+        <w:spacing w:after="60"/>
+        <w:ind w:left="510" w:hanging="340"/>
+      </w:pPr>
+      <w:r>
+        <w:rPr>
+          <w:b/>
+        </w:rPr>
+        <w:t xml:space="preserve">4. </w:t>
+      </w:r>
+      <w:r>
+        <w:t xml:space="preserve">Resumo esperado: </w:t>
+      </w:r>
+      <w:r>
+        <w:rPr>
+          <w:b/>
+        </w:rPr>
+        <w:t>6 pontos · 0 linhas · 1 polígono · 0 textos</w:t>
+      </w:r>
+      <w:r>
+        <w:t>, nas layers CERCA e POSTE. Aviso esperado: “Layer POSTE: só 2 ponto(s) — não deu para formar o polígono” — correto, pois postes não formam polígono. O P1, que está no meio do arquivo, não interfere no polígono da cerca, porque pertence a outro código.</w:t>
+      </w:r>
+    </w:p>
+    <w:p>
+      <w:pPr>
+        <w:spacing w:after="60"/>
+        <w:ind w:left="510" w:hanging="340"/>
+      </w:pPr>
+      <w:r>
+        <w:rPr>
+          <w:b/>
+        </w:rPr>
+        <w:t xml:space="preserve">5. </w:t>
+      </w:r>
+      <w:r>
+        <w:t xml:space="preserve">Saída: </w:t>
+      </w:r>
+      <w:r>
+        <w:rPr>
+          <w:b/>
+        </w:rPr>
+        <w:t>DXF</w:t>
+      </w:r>
+      <w:r>
+        <w:t xml:space="preserve">, </w:t>
+      </w:r>
+      <w:r>
+        <w:rPr>
+          <w:b/>
+        </w:rPr>
+        <w:t>UTM</w:t>
+      </w:r>
+      <w:r>
+        <w:t xml:space="preserve"> fuso </w:t>
+      </w:r>
+      <w:r>
+        <w:rPr>
+          <w:b/>
+        </w:rPr>
+        <w:t>22 Sul</w:t>
+      </w:r>
+      <w:r>
+        <w:t xml:space="preserve">, </w:t>
+      </w:r>
+      <w:r>
+        <w:rPr>
+          <w:b/>
+        </w:rPr>
+        <w:t>Converter e baixar</w:t>
+      </w:r>
+      <w:r>
+        <w:t xml:space="preserve">. No CAD, o ponto M1 deve estar em </w:t>
+      </w:r>
+      <w:r>
+        <w:rPr>
+          <w:b/>
+        </w:rPr>
+        <w:t>E = 742 519,448 m</w:t>
+      </w:r>
+      <w:r>
+        <w:t xml:space="preserve"> e </w:t>
+      </w:r>
+      <w:r>
+        <w:rPr>
+          <w:b/>
+        </w:rPr>
+        <w:t>N = 6 945 305,987 m</w:t>
+      </w:r>
+      <w:r>
+        <w:t>, com cota 4,00 m.</w:t>
+      </w:r>
+    </w:p>
+    <w:p>
+      <w:pPr>
+        <w:jc w:val="both"/>
+      </w:pPr>
+      <w:r>
+        <w:t xml:space="preserve">Se a opção fosse </w:t>
+      </w:r>
+      <w:r>
+        <w:rPr>
+          <w:b/>
+        </w:rPr>
+        <w:t>na sequência do arquivo (todos os pontos)</w:t>
+      </w:r>
+      <w:r>
+        <w:t>, o polígono passaria também pelos postes, na ordem M1, M2, P1, M3, M4, P2, numa layer LIGACAO. A opção certa depende de como o levantamento foi codificado.</w:t>
       </w:r>
     </w:p>
     <w:p>
@@ -3295,6 +4135,118 @@
               <w:rPr>
                 <w:sz w:val="19"/>
               </w:rPr>
+              <w:t>“N linha(s) com problema … linha 1 …” (TXT/CSV)</w:t>
+            </w:r>
+          </w:p>
+        </w:tc>
+        <w:tc>
+          <w:tcPr>
+            <w:tcW w:type="dxa" w:w="2835"/>
+          </w:tcPr>
+          <w:p>
+            <w:r>
+              <w:rPr>
+                <w:sz w:val="19"/>
+              </w:rPr>
+            </w:r>
+            <w:r>
+              <w:rPr>
+                <w:sz w:val="19"/>
+              </w:rPr>
+              <w:t>Cabeçalho não marcado, separador errado ou coluna trocada.</w:t>
+            </w:r>
+          </w:p>
+        </w:tc>
+        <w:tc>
+          <w:tcPr>
+            <w:tcW w:type="dxa" w:w="3628"/>
+          </w:tcPr>
+          <w:p>
+            <w:r>
+              <w:rPr>
+                <w:sz w:val="19"/>
+              </w:rPr>
+            </w:r>
+            <w:r>
+              <w:rPr>
+                <w:sz w:val="19"/>
+              </w:rPr>
+              <w:t>Marcar “Primeira linha é cabeçalho”; conferir separador e colunas na prévia.</w:t>
+            </w:r>
+          </w:p>
+        </w:tc>
+      </w:tr>
+      <w:tr>
+        <w:tc>
+          <w:tcPr>
+            <w:tcW w:type="dxa" w:w="2608"/>
+          </w:tcPr>
+          <w:p>
+            <w:r>
+              <w:rPr>
+                <w:sz w:val="19"/>
+              </w:rPr>
+            </w:r>
+            <w:r>
+              <w:rPr>
+                <w:sz w:val="19"/>
+              </w:rPr>
+              <w:t>“… não é Longitude válida” com gg,mmss</w:t>
+            </w:r>
+          </w:p>
+        </w:tc>
+        <w:tc>
+          <w:tcPr>
+            <w:tcW w:type="dxa" w:w="2835"/>
+          </w:tcPr>
+          <w:p>
+            <w:r>
+              <w:rPr>
+                <w:sz w:val="19"/>
+              </w:rPr>
+            </w:r>
+            <w:r>
+              <w:rPr>
+                <w:sz w:val="19"/>
+              </w:rPr>
+              <w:t>Minutos ou segundos ≥ 60, ou arquivo em graus decimais.</w:t>
+            </w:r>
+          </w:p>
+        </w:tc>
+        <w:tc>
+          <w:tcPr>
+            <w:tcW w:type="dxa" w:w="3628"/>
+          </w:tcPr>
+          <w:p>
+            <w:r>
+              <w:rPr>
+                <w:sz w:val="19"/>
+              </w:rPr>
+            </w:r>
+            <w:r>
+              <w:rPr>
+                <w:sz w:val="19"/>
+              </w:rPr>
+              <w:t>Conferir a notação no arquivo; escolher Geodésicas (graus decimais), se for o caso.</w:t>
+            </w:r>
+          </w:p>
+        </w:tc>
+      </w:tr>
+      <w:tr>
+        <w:tc>
+          <w:tcPr>
+            <w:tcW w:type="dxa" w:w="2608"/>
+          </w:tcPr>
+          <w:p>
+            <w:r>
+              <w:rPr>
+                <w:sz w:val="19"/>
+              </w:rPr>
+            </w:r>
+            <w:r>
+              <w:rPr>
+                <w:sz w:val="19"/>
+              </w:rPr>
               <w:t>“Servidor do OpenStreetMap indisponível…”</w:t>
             </w:r>
           </w:p>
@@ -3484,6 +4436,23 @@
       </w:r>
     </w:p>
     <w:p>
+      <w:pPr>
+        <w:pStyle w:val="ListBullet"/>
+      </w:pPr>
+      <w:r>
+        <w:t xml:space="preserve">No </w:t>
+      </w:r>
+      <w:r>
+        <w:rPr>
+          <w:b/>
+        </w:rPr>
+        <w:t>TXT/CSV</w:t>
+      </w:r>
+      <w:r>
+        <w:t>, a linha e o polígono seguem a ordem do arquivo; conferir no mapa se o traçado não cruza a si mesmo antes de converter.</w:t>
+      </w:r>
+    </w:p>
+    <w:p>
       <w:r>
         <w:br w:type="page"/>
       </w:r>
@@ -3663,6 +4632,64 @@
         <w:t xml:space="preserve">8. </w:t>
       </w:r>
       <w:r>
+        <w:t xml:space="preserve">Um arquivo TXT traz a longitude </w:t>
+      </w:r>
+      <w:r>
+        <w:rPr>
+          <w:rFonts w:ascii="Consolas" w:hAnsi="Consolas"/>
+          <w:sz w:val="20"/>
+        </w:rPr>
+        <w:t>-48,3228781</w:t>
+      </w:r>
+      <w:r>
+        <w:t xml:space="preserve"> no formato gg,mmss. Converter para graus decimais, mostrando o cálculo, e indicar se o ponto está a leste ou a oeste de Greenwich.</w:t>
+      </w:r>
+    </w:p>
+    <w:p>
+      <w:pPr>
+        <w:spacing w:after="60"/>
+        <w:ind w:left="510" w:hanging="340"/>
+      </w:pPr>
+      <w:r>
+        <w:rPr>
+          <w:b/>
+        </w:rPr>
+        <w:t xml:space="preserve">9. </w:t>
+      </w:r>
+      <w:r>
+        <w:t xml:space="preserve">Um TXT de perímetro tem os vértices V1 (MARCO), V2 (PIQUETE), V3 (MARCO) e V4 (ÁRVORE), na ordem do caminhamento. Com a coluna de código indicada e </w:t>
+      </w:r>
+      <w:r>
+        <w:rPr>
+          <w:b/>
+        </w:rPr>
+        <w:t>Pontos e polígono</w:t>
+      </w:r>
+      <w:r>
+        <w:t xml:space="preserve">, qual opção de </w:t>
+      </w:r>
+      <w:r>
+        <w:rPr>
+          <w:b/>
+        </w:rPr>
+        <w:t>Ligar os pontos</w:t>
+      </w:r>
+      <w:r>
+        <w:t xml:space="preserve"> gera o perímetro do imóvel? O que aconteceria com a outra opção?</w:t>
+      </w:r>
+    </w:p>
+    <w:p>
+      <w:pPr>
+        <w:spacing w:after="60"/>
+        <w:ind w:left="510" w:hanging="340"/>
+      </w:pPr>
+      <w:r>
+        <w:rPr>
+          <w:b/>
+        </w:rPr>
+        <w:t xml:space="preserve">10. </w:t>
+      </w:r>
+      <w:r>
         <w:t>Desafio: um DXF exportado do QGIS tem vértices com X ≈ −5 401 872 e Y ≈ −3 198 591. O aplicativo não o importa em UTM nem em geodésicas. Explicar a causa provável e o procedimento de correção.</w:t>
       </w:r>
     </w:p>
@@ -3856,6 +4883,69 @@
         <w:t xml:space="preserve">8. </w:t>
       </w:r>
       <w:r>
+        <w:t xml:space="preserve">48°32'28,781" → 48 + 32/60 + 28,781/3600 = 48 + 0,5333333 + 0,0079947 = 48,5413281°. Com o sinal negativo: </w:t>
+      </w:r>
+      <w:r>
+        <w:rPr>
+          <w:b/>
+        </w:rPr>
+        <w:t>−48,5413281°</w:t>
+      </w:r>
+      <w:r>
+        <w:t xml:space="preserve">, a </w:t>
+      </w:r>
+      <w:r>
+        <w:rPr>
+          <w:b/>
+        </w:rPr>
+        <w:t>oeste</w:t>
+      </w:r>
+      <w:r>
+        <w:t xml:space="preserve"> de Greenwich (é a longitude do vértice do exercício 1).</w:t>
+      </w:r>
+    </w:p>
+    <w:p>
+      <w:pPr>
+        <w:spacing w:after="60"/>
+        <w:ind w:left="510" w:hanging="340"/>
+      </w:pPr>
+      <w:r>
+        <w:rPr>
+          <w:b/>
+        </w:rPr>
+        <w:t xml:space="preserve">9. </w:t>
+      </w:r>
+      <w:r>
+        <w:rPr>
+          <w:b/>
+        </w:rPr>
+        <w:t>Na sequência do arquivo (todos os pontos)</w:t>
+      </w:r>
+      <w:r>
+        <w:t xml:space="preserve">: um único polígono V1 → V2 → V3 → V4 na layer LIGACAO, com os pontos ainda separados por código. </w:t>
+      </w:r>
+      <w:r>
+        <w:rPr>
+          <w:b/>
+        </w:rPr>
+        <w:t>Por código</w:t>
+      </w:r>
+      <w:r>
+        <w:t>, o aplicativo tentaria um polígono por layer: MARCO teria só 2 pontos, PIQUETE e ÁRVORE só 1 — nenhum polígono seria formado, e apareceriam avisos.</w:t>
+      </w:r>
+    </w:p>
+    <w:p>
+      <w:pPr>
+        <w:spacing w:after="60"/>
+        <w:ind w:left="510" w:hanging="340"/>
+      </w:pPr>
+      <w:r>
+        <w:rPr>
+          <w:b/>
+        </w:rPr>
+        <w:t xml:space="preserve">10. </w:t>
+      </w:r>
+      <w:r>
         <w:t xml:space="preserve">Os valores são de </w:t>
       </w:r>
       <w:r>
@@ -3912,7 +5002,7 @@
         <w:t>Resolução R.PR n. 1, de 24 de fevereiro de 2015</w:t>
       </w:r>
       <w:r>
-        <w:t>. Define a data de término do período de transição definido na RPR 01/2005 e dá outras providências sobre a transformação entre os referenciais geodésicos adotados no Brasil. Rio de Janeiro: IBGE, 2015. Disponível em: https://geoftp.ibge.gov.br/metodos_e_outros_documentos_de_referencia/normas/rpr_01_2015_sirgas2000.pdf. Acesso em: 28 set. 2026.</w:t>
+        <w:t>. Define a data de término do período de transição definido na RPR 01/2005 e dá outras providências sobre a transformação entre os referenciais geodésicos adotados no Brasil. Rio de Janeiro: IBGE, 2015. Disponível em: https://geoftp.ibge.gov.br/metodos_e_outros_documentos_de_referencia/normas/rpr_01_2015_sirgas2000.pdf. Acesso em: 2 out. 2026.</w:t>
       </w:r>
     </w:p>
     <w:p>
@@ -3930,7 +5020,7 @@
         <w:t>EPSG Geodetic Parameter Dataset</w:t>
       </w:r>
       <w:r>
-        <w:t>. [S. l.]: IOGP, 2026. Disponível em: https://epsg.org. Acesso em: 28 set. 2026.</w:t>
+        <w:t>. [S. l.]: IOGP, 2026. Disponível em: https://epsg.org. Acesso em: 2 out. 2026.</w:t>
       </w:r>
     </w:p>
     <w:p>
@@ -3948,7 +5038,7 @@
         <w:t>OGC KML</w:t>
       </w:r>
       <w:r>
-        <w:t>: version 2.2.0. OGC 07-147r2. Wayland: OGC, 2008. Disponível em: https://www.ogc.org/standards/kml. Acesso em: 28 set. 2026.</w:t>
+        <w:t>: version 2.2.0. OGC 07-147r2. Wayland: OGC, 2008. Disponível em: https://www.ogc.org/standards/kml. Acesso em: 2 out. 2026.</w:t>
       </w:r>
     </w:p>
     <w:p>
@@ -3966,7 +5056,7 @@
         <w:t>Copyright and License</w:t>
       </w:r>
       <w:r>
-        <w:t>. [S. l.]: OpenStreetMap Foundation, 2026. Disponível em: https://www.openstreetmap.org/copyright. Acesso em: 28 set. 2026.</w:t>
+        <w:t>. [S. l.]: OpenStreetMap Foundation, 2026. Disponível em: https://www.openstreetmap.org/copyright. Acesso em: 2 out. 2026.</w:t>
       </w:r>
     </w:p>
     <w:p>
@@ -3984,7 +5074,7 @@
         <w:t>SIG@SC</w:t>
       </w:r>
       <w:r>
-        <w:t>: URLs de serviços WMS e WMTS. Florianópolis: SDE, 2026. Disponível em: https://sigsc.sc.gov.br/wms-urls.html. Acesso em: 28 set. 2026.</w:t>
+        <w:t>: URLs de serviços WMS e WMTS. Florianópolis: SDE, 2026. Disponível em: https://sigsc.sc.gov.br/wms-urls.html. Acesso em: 2 out. 2026.</w:t>
       </w:r>
     </w:p>
     <w:sectPr>

</xml_diff>